<commit_message>
feat: add versioned team adapters and configurable exports
Implement immutable scheme revisions, typed fields, material rules, payee selection, shared export contexts, configurable Word templates, four output types, bindle v5 and adapter CLI tooling. Include example packages, protocol schemas, documentation, CI resource checks and existing workspace design skills.

Verify the complete workspace and fix installation cancellation during resource writes, export destination journal failure recovery, and migration fixtures that depended on HEAD. Validation: 446 tests and 12 subtests passed; 50 legacy tests skipped because external invoice samples are absent. Core and print self-tests, JavaScript syntax checks and resource validation passed.
</commit_message>
<xml_diff>
--- a/tidoc_print/templates/报账说明模板.docx
+++ b/tidoc_print/templates/报账说明模板.docx
@@ -14,79 +14,7 @@
         </w:rPr>
       </w:pPr>
       <w:r>
-        <w:rPr>
-          <w:rFonts w:hint="eastAsia"/>
-          <w:szCs w:val="21"/>
-        </w:rPr>
-        <w:t>机械与车辆学院申请支出0.00 元。方程式车队比赛物资采买。人民币0.00元需打款至学生账户如下：</w:t>
-      </w:r>
-      <w:r>
-        <w:rPr>
-          <w:rFonts w:hint="eastAsia"/>
-          <w:b/>
-          <w:bCs/>
-          <w:szCs w:val="21"/>
-        </w:rPr>
-      </w:r>
-      <w:r>
-        <w:rPr>
-          <w:rFonts w:hint="eastAsia"/>
-          <w:b/>
-          <w:bCs/>
-          <w:szCs w:val="21"/>
-        </w:rPr>
-      </w:r>
-      <w:r>
-        <w:rPr>
-          <w:rFonts w:hint="eastAsia"/>
-          <w:szCs w:val="21"/>
-        </w:rPr>
-      </w:r>
-      <w:r>
-        <w:rPr>
-          <w:rFonts w:hint="eastAsia"/>
-          <w:szCs w:val="21"/>
-        </w:rPr>
-      </w:r>
-      <w:r>
-        <w:rPr>
-          <w:rFonts w:hint="eastAsia"/>
-          <w:b/>
-          <w:bCs/>
-          <w:szCs w:val="21"/>
-        </w:rPr>
-      </w:r>
-      <w:r>
-        <w:rPr>
-          <w:rFonts w:hint="eastAsia"/>
-          <w:szCs w:val="21"/>
-        </w:rPr>
-      </w:r>
-      <w:r>
-        <w:rPr>
-          <w:rFonts w:hint="eastAsia"/>
-          <w:szCs w:val="21"/>
-        </w:rPr>
-      </w:r>
-      <w:proofErr w:type="gramStart"/>
-      <w:r>
-        <w:rPr>
-          <w:rFonts w:hint="eastAsia"/>
-          <w:szCs w:val="21"/>
-        </w:rPr>
-      </w:r>
-      <w:r>
-        <w:rPr>
-          <w:rFonts w:hint="eastAsia"/>
-          <w:szCs w:val="21"/>
-        </w:rPr>
-      </w:r>
-      <w:proofErr w:type="gramEnd"/>
-      <w:r>
-        <w:rPr>
-          <w:rFonts w:hint="eastAsia"/>
-          <w:szCs w:val="21"/>
-        </w:rPr>
+        <w:t>{{ scheme.organization.department|default("", true) }}申请支出{{ totals.invoice|money }} 元。{{ scheme.organization.purpose|default("", true) }}人民币{{ totals.invoice|money }}元{% if payee %}需打款至账户如下：{% endif %}</w:t>
       </w:r>
     </w:p>
     <w:p>
@@ -100,76 +28,7 @@
         </w:rPr>
       </w:pPr>
       <w:r>
-        <w:rPr>
-          <w:rFonts w:hint="eastAsia"/>
-          <w:szCs w:val="21"/>
-        </w:rPr>
-        <w:t>学号：   姓名：   联系方式：</w:t>
-      </w:r>
-      <w:r>
-        <w:rPr>
-          <w:rFonts w:hint="eastAsia"/>
-          <w:szCs w:val="21"/>
-        </w:rPr>
-      </w:r>
-      <w:r>
-        <w:rPr>
-          <w:rFonts w:hint="eastAsia"/>
-          <w:szCs w:val="21"/>
-        </w:rPr>
-      </w:r>
-      <w:r>
-        <w:rPr>
-          <w:rFonts w:hint="eastAsia"/>
-          <w:szCs w:val="21"/>
-        </w:rPr>
-      </w:r>
-      <w:r>
-        <w:rPr>
-          <w:szCs w:val="21"/>
-        </w:rPr>
-      </w:r>
-      <w:r>
-        <w:rPr>
-          <w:rFonts w:hint="eastAsia"/>
-          <w:szCs w:val="21"/>
-        </w:rPr>
-      </w:r>
-      <w:proofErr w:type="gramStart"/>
-      <w:r>
-        <w:rPr>
-          <w:rFonts w:hint="eastAsia"/>
-          <w:szCs w:val="21"/>
-        </w:rPr>
-      </w:r>
-      <w:proofErr w:type="gramEnd"/>
-      <w:r>
-        <w:rPr>
-          <w:rFonts w:hint="eastAsia"/>
-          <w:szCs w:val="21"/>
-        </w:rPr>
-      </w:r>
-      <w:r>
-        <w:rPr>
-          <w:szCs w:val="21"/>
-        </w:rPr>
-      </w:r>
-      <w:r>
-        <w:rPr>
-          <w:rFonts w:hint="eastAsia"/>
-          <w:szCs w:val="21"/>
-        </w:rPr>
-      </w:r>
-      <w:r>
-        <w:rPr>
-          <w:szCs w:val="21"/>
-        </w:rPr>
-      </w:r>
-      <w:r>
-        <w:rPr>
-          <w:rFonts w:hint="eastAsia"/>
-          <w:szCs w:val="21"/>
-        </w:rPr>
+        <w:t>{% if payee %}人员编号：{{ payee.personnel_id }}   姓名：{{ payee.name }}   联系方式：{{ payee.contact }}{% endif %}</w:t>
       </w:r>
     </w:p>
     <w:p>
@@ -182,51 +41,7 @@
         </w:rPr>
       </w:pPr>
       <w:r>
-        <w:rPr>
-          <w:rFonts w:hint="eastAsia"/>
-          <w:szCs w:val="21"/>
-        </w:rPr>
-        <w:t>开户行：       卡号：</w:t>
-      </w:r>
-      <w:r>
-        <w:rPr>
-          <w:rFonts w:hint="eastAsia"/>
-          <w:szCs w:val="21"/>
-        </w:rPr>
-      </w:r>
-      <w:r>
-        <w:rPr>
-          <w:rFonts w:hint="eastAsia"/>
-          <w:szCs w:val="21"/>
-        </w:rPr>
-      </w:r>
-      <w:r>
-        <w:rPr>
-          <w:rFonts w:hint="eastAsia"/>
-          <w:szCs w:val="21"/>
-        </w:rPr>
-      </w:r>
-      <w:r>
-        <w:rPr>
-          <w:rFonts w:hint="eastAsia"/>
-          <w:szCs w:val="21"/>
-        </w:rPr>
-      </w:r>
-      <w:r>
-        <w:rPr>
-          <w:szCs w:val="21"/>
-        </w:rPr>
-      </w:r>
-      <w:r>
-        <w:rPr>
-          <w:rFonts w:hint="eastAsia"/>
-          <w:szCs w:val="21"/>
-        </w:rPr>
-      </w:r>
-      <w:r>
-        <w:rPr>
-          <w:szCs w:val="21"/>
-        </w:rPr>
+        <w:t>{% if payee %}开户行：{{ payee.bank_name }}       卡号：{{ payee.account_number }}{% endif %}</w:t>
       </w:r>
     </w:p>
     <w:p>
@@ -357,6 +172,29 @@
         </w:tc>
       </w:tr>
       <w:tr>
+        <w:tc>
+          <w:p>
+            <w:r>
+              <w:t>{%tr for row in rows %}</w:t>
+            </w:r>
+          </w:p>
+        </w:tc>
+        <w:tc>
+          <w:p>
+            <w:r>
+              <w:t/>
+            </w:r>
+          </w:p>
+        </w:tc>
+        <w:tc>
+          <w:p>
+            <w:r>
+              <w:t/>
+            </w:r>
+          </w:p>
+        </w:tc>
+      </w:tr>
+      <w:tr>
         <w:trPr>
           <w:trHeight w:val="170"/>
           <w:jc w:val="center"/>
@@ -368,21 +206,8 @@
             <w:vAlign w:val="center"/>
           </w:tcPr>
           <w:p>
-            <w:pPr>
-              <w:pStyle w:val="a9"/>
-              <w:ind w:firstLineChars="0" w:firstLine="0"/>
-              <w:jc w:val="left"/>
-              <w:rPr>
-                <w:sz w:val="18"/>
-                <w:szCs w:val="18"/>
-              </w:rPr>
-            </w:pPr>
             <w:r>
-              <w:rPr>
-                <w:rFonts w:hint="eastAsia"/>
-                <w:color w:val="000000"/>
-                <w:sz w:val="22"/>
-              </w:rPr>
+              <w:t>{{ row.actual_name }}</w:t>
             </w:r>
           </w:p>
         </w:tc>
@@ -393,42 +218,8 @@
             <w:vAlign w:val="center"/>
           </w:tcPr>
           <w:p>
-            <w:pPr>
-              <w:pStyle w:val="a9"/>
-              <w:ind w:firstLineChars="0" w:firstLine="0"/>
-              <w:jc w:val="left"/>
-              <w:rPr>
-                <w:sz w:val="18"/>
-                <w:szCs w:val="18"/>
-              </w:rPr>
-            </w:pPr>
             <w:r>
-              <w:rPr>
-                <w:rFonts w:hint="eastAsia"/>
-                <w:color w:val="000000"/>
-                <w:sz w:val="22"/>
-              </w:rPr>
-            </w:r>
-            <w:r>
-              <w:rPr>
-                <w:rFonts w:hint="eastAsia"/>
-                <w:color w:val="000000"/>
-                <w:sz w:val="22"/>
-              </w:rPr>
-            </w:r>
-            <w:r>
-              <w:rPr>
-                <w:rFonts w:hint="eastAsia"/>
-                <w:color w:val="000000"/>
-                <w:sz w:val="22"/>
-              </w:rPr>
-            </w:r>
-            <w:r>
-              <w:rPr>
-                <w:rFonts w:hint="eastAsia"/>
-                <w:color w:val="000000"/>
-                <w:sz w:val="22"/>
-              </w:rPr>
+              <w:t>{{ row.product_name }}</w:t>
             </w:r>
           </w:p>
         </w:tc>
@@ -438,20 +229,31 @@
             <w:vAlign w:val="center"/>
           </w:tcPr>
           <w:p>
-            <w:pPr>
-              <w:pStyle w:val="a9"/>
-              <w:ind w:firstLineChars="0" w:firstLine="0"/>
-              <w:rPr>
-                <w:sz w:val="18"/>
-                <w:szCs w:val="18"/>
-              </w:rPr>
-            </w:pPr>
             <w:r>
-              <w:rPr>
-                <w:rFonts w:hint="eastAsia"/>
-                <w:color w:val="000000"/>
-                <w:sz w:val="22"/>
-              </w:rPr>
+              <w:t>¥{{ row.total|money }}</w:t>
+            </w:r>
+          </w:p>
+        </w:tc>
+      </w:tr>
+      <w:tr>
+        <w:tc>
+          <w:p>
+            <w:r>
+              <w:t>{%tr endfor %}</w:t>
+            </w:r>
+          </w:p>
+        </w:tc>
+        <w:tc>
+          <w:p>
+            <w:r>
+              <w:t/>
+            </w:r>
+          </w:p>
+        </w:tc>
+        <w:tc>
+          <w:p>
+            <w:r>
+              <w:t/>
             </w:r>
           </w:p>
         </w:tc>
@@ -501,11 +303,7 @@
         </w:rPr>
       </w:pPr>
       <w:r>
-        <w:rPr>
-          <w:rFonts w:hint="eastAsia"/>
-          <w:szCs w:val="21"/>
-        </w:rPr>
-        <w:t>机械与车辆学院：</w:t>
+        <w:t>{{ scheme.organization.department|default("", true) }}：</w:t>
       </w:r>
     </w:p>
     <w:p>
@@ -524,11 +322,7 @@
         </w:rPr>
       </w:pPr>
       <w:r>
-        <w:rPr>
-          <w:rFonts w:hint="eastAsia"/>
-          <w:szCs w:val="21"/>
-        </w:rPr>
-        <w:t>教育基金会：</w:t>
+        <w:t>{{ title.name }}：</w:t>
       </w:r>
     </w:p>
     <w:p>
@@ -549,52 +343,7 @@
         </w:rPr>
       </w:pPr>
       <w:r>
-        <w:rPr>
-          <w:rFonts w:hint="eastAsia"/>
-          <w:szCs w:val="21"/>
-        </w:rPr>
-        <w:t>年月日</w:t>
-      </w:r>
-      <w:r>
-        <w:rPr>
-          <w:szCs w:val="21"/>
-        </w:rPr>
-      </w:r>
-      <w:r>
-        <w:rPr>
-          <w:rFonts w:hint="eastAsia"/>
-          <w:szCs w:val="21"/>
-        </w:rPr>
-      </w:r>
-      <w:r>
-        <w:rPr>
-          <w:rFonts w:hint="eastAsia"/>
-          <w:szCs w:val="21"/>
-        </w:rPr>
-      </w:r>
-      <w:r>
-        <w:rPr>
-          <w:rFonts w:hint="eastAsia"/>
-          <w:szCs w:val="21"/>
-        </w:rPr>
-      </w:r>
-      <w:r>
-        <w:rPr>
-          <w:rFonts w:hint="eastAsia"/>
-          <w:szCs w:val="21"/>
-        </w:rPr>
-      </w:r>
-      <w:r>
-        <w:rPr>
-          <w:rFonts w:hint="eastAsia"/>
-          <w:szCs w:val="21"/>
-        </w:rPr>
-      </w:r>
-      <w:r>
-        <w:rPr>
-          <w:rFonts w:hint="eastAsia"/>
-          <w:szCs w:val="21"/>
-        </w:rPr>
+        <w:t>{{ export.date|date("chinese") }}</w:t>
       </w:r>
     </w:p>
     <w:sectPr>
@@ -1040,6 +789,7 @@
       <w:jc w:val="both"/>
     </w:pPr>
     <w:rPr>
+      <w:rFonts w:ascii="Arial" w:hAnsi="Arial" w:eastAsia="Songti SC"/>
       <w:kern w:val="2"/>
       <w:sz w:val="21"/>
       <w:szCs w:val="22"/>
@@ -1050,6 +800,9 @@
     <w:uiPriority w:val="1"/>
     <w:semiHidden/>
     <w:unhideWhenUsed/>
+    <w:rPr>
+      <w:rFonts w:ascii="Arial" w:hAnsi="Arial" w:eastAsia="Songti SC"/>
+    </w:rPr>
   </w:style>
   <w:style w:type="table" w:default="1" w:styleId="a1">
     <w:name w:val="Normal Table"/>
@@ -1081,6 +834,7 @@
     <w:unhideWhenUsed/>
     <w:qFormat/>
     <w:rPr>
+      <w:rFonts w:ascii="Arial" w:hAnsi="Arial" w:eastAsia="Songti SC"/>
       <w:sz w:val="18"/>
       <w:szCs w:val="18"/>
     </w:rPr>
@@ -1101,6 +855,7 @@
       <w:jc w:val="left"/>
     </w:pPr>
     <w:rPr>
+      <w:rFonts w:ascii="Arial" w:hAnsi="Arial" w:eastAsia="Songti SC"/>
       <w:sz w:val="18"/>
       <w:szCs w:val="18"/>
     </w:rPr>
@@ -1124,6 +879,7 @@
       <w:jc w:val="center"/>
     </w:pPr>
     <w:rPr>
+      <w:rFonts w:ascii="Arial" w:hAnsi="Arial" w:eastAsia="Songti SC"/>
       <w:sz w:val="18"/>
       <w:szCs w:val="18"/>
     </w:rPr>
@@ -1135,6 +891,7 @@
     <w:uiPriority w:val="99"/>
     <w:qFormat/>
     <w:rPr>
+      <w:rFonts w:ascii="Arial" w:hAnsi="Arial" w:eastAsia="Songti SC"/>
       <w:sz w:val="18"/>
       <w:szCs w:val="18"/>
     </w:rPr>
@@ -1146,6 +903,7 @@
     <w:uiPriority w:val="99"/>
     <w:qFormat/>
     <w:rPr>
+      <w:rFonts w:ascii="Arial" w:hAnsi="Arial" w:eastAsia="Songti SC"/>
       <w:sz w:val="18"/>
       <w:szCs w:val="18"/>
     </w:rPr>
@@ -1158,6 +916,9 @@
     <w:pPr>
       <w:ind w:firstLineChars="200" w:firstLine="420"/>
     </w:pPr>
+    <w:rPr>
+      <w:rFonts w:ascii="Arial" w:hAnsi="Arial" w:eastAsia="Songti SC"/>
+    </w:rPr>
   </w:style>
   <w:style w:type="character" w:customStyle="1" w:styleId="a4">
     <w:name w:val="批注框文本 字符"/>
@@ -1167,6 +928,7 @@
     <w:semiHidden/>
     <w:qFormat/>
     <w:rPr>
+      <w:rFonts w:ascii="Arial" w:hAnsi="Arial" w:eastAsia="Songti SC"/>
       <w:sz w:val="18"/>
       <w:szCs w:val="18"/>
     </w:rPr>

</xml_diff>